<commit_message>
Endurece roles (RBAC) y agrega vigencia de licencia con renovacion remota; informe de asistencia con firmas, certificado de pago y ajustes de revision — v2.3.0
Co-Authored-By: Claude Sonnet 5 <noreply@anthropic.com>
</commit_message>
<xml_diff>
--- a/templates/certificado_pago.docx
+++ b/templates/certificado_pago.docx
@@ -703,7 +703,33 @@
         <w:sz w:val="18"/>
       </w:rPr>
       <w:fldChar w:fldCharType="begin"/>
-      <w:instrText xml:space="preserve">PAGE</w:instrText>
+    </w:r>
+    <w:r>
+      <w:rPr>
+        <w:rFonts w:ascii="Century Gothic" w:hAnsi="Century Gothic"/>
+        <w:sz w:val="18"/>
+      </w:rPr>
+      <w:instrText xml:space="preserve"> PAGE </w:instrText>
+    </w:r>
+    <w:r>
+      <w:rPr>
+        <w:rFonts w:ascii="Century Gothic" w:hAnsi="Century Gothic"/>
+        <w:sz w:val="18"/>
+      </w:rPr>
+      <w:fldChar w:fldCharType="separate"/>
+    </w:r>
+    <w:r>
+      <w:rPr>
+        <w:rFonts w:ascii="Century Gothic" w:hAnsi="Century Gothic"/>
+        <w:sz w:val="18"/>
+      </w:rPr>
+      <w:t>1</w:t>
+    </w:r>
+    <w:r>
+      <w:rPr>
+        <w:rFonts w:ascii="Century Gothic" w:hAnsi="Century Gothic"/>
+        <w:sz w:val="18"/>
+      </w:rPr>
       <w:fldChar w:fldCharType="end"/>
     </w:r>
     <w:r>
@@ -719,7 +745,33 @@
         <w:sz w:val="18"/>
       </w:rPr>
       <w:fldChar w:fldCharType="begin"/>
-      <w:instrText xml:space="preserve">NUMPAGES</w:instrText>
+    </w:r>
+    <w:r>
+      <w:rPr>
+        <w:rFonts w:ascii="Century Gothic" w:hAnsi="Century Gothic"/>
+        <w:sz w:val="18"/>
+      </w:rPr>
+      <w:instrText xml:space="preserve"> NUMPAGES </w:instrText>
+    </w:r>
+    <w:r>
+      <w:rPr>
+        <w:rFonts w:ascii="Century Gothic" w:hAnsi="Century Gothic"/>
+        <w:sz w:val="18"/>
+      </w:rPr>
+      <w:fldChar w:fldCharType="separate"/>
+    </w:r>
+    <w:r>
+      <w:rPr>
+        <w:rFonts w:ascii="Century Gothic" w:hAnsi="Century Gothic"/>
+        <w:sz w:val="18"/>
+      </w:rPr>
+      <w:t>1</w:t>
+    </w:r>
+    <w:r>
+      <w:rPr>
+        <w:rFonts w:ascii="Century Gothic" w:hAnsi="Century Gothic"/>
+        <w:sz w:val="18"/>
+      </w:rPr>
       <w:fldChar w:fldCharType="end"/>
     </w:r>
   </w:p>

</xml_diff>